<commit_message>
Adicionando última versão de documentação e objetivos futuros
</commit_message>
<xml_diff>
--- a/Documentacao/RPG _REIMAGINE_DOCUMENTATION.docx
+++ b/Documentacao/RPG _REIMAGINE_DOCUMENTATION.docx
@@ -2458,18 +2458,18 @@
         <w:jc w:val="both"/>
         <w:rPr>
           <w:rFonts w:ascii="Arial" w:hAnsi="Arial" w:eastAsia="Arial" w:cs="Arial"/>
-          <w:b w:val="0"/>
-          <w:bCs w:val="0"/>
-          <w:color w:val="auto"/>
-          <w:sz w:val="24"/>
-          <w:szCs w:val="24"/>
-        </w:rPr>
-      </w:pPr>
-      <w:r>
-        <w:rPr>
-          <w:rFonts w:ascii="Arial" w:hAnsi="Arial" w:eastAsia="Arial" w:cs="Arial"/>
-          <w:b w:val="0"/>
-          <w:bCs w:val="0"/>
+          <w:b w:val="1"/>
+          <w:bCs w:val="1"/>
+          <w:color w:val="auto"/>
+          <w:sz w:val="24"/>
+          <w:szCs w:val="24"/>
+        </w:rPr>
+      </w:pPr>
+      <w:r>
+        <w:rPr>
+          <w:rFonts w:ascii="Arial" w:hAnsi="Arial" w:eastAsia="Arial" w:cs="Arial"/>
+          <w:b w:val="1"/>
+          <w:bCs w:val="1"/>
           <w:color w:val="auto"/>
           <w:sz w:val="24"/>
           <w:szCs w:val="24"/>
@@ -2683,14 +2683,6 @@
         <w:spacing w:line="360" w:lineRule="auto"/>
         <w:ind w:firstLine="708"/>
         <w:jc w:val="both"/>
-        <w:rPr>
-          <w:rFonts w:ascii="Arial" w:hAnsi="Arial" w:eastAsia="Arial" w:cs="Arial"/>
-          <w:b w:val="0"/>
-          <w:bCs w:val="0"/>
-          <w:color w:val="auto"/>
-          <w:sz w:val="24"/>
-          <w:szCs w:val="24"/>
-        </w:rPr>
       </w:pPr>
       <w:r>
         <w:rPr>
@@ -2725,6 +2717,132 @@
         </w:rPr>
         <w:t xml:space="preserve"> dentro de seus próprios sistemas, sem necessidade da utilização de sistemas pré-definidos.</w:t>
       </w:r>
+    </w:p>
+    <w:p>
+      <w:pPr>
+        <w:pStyle w:val="Normal"/>
+        <w:spacing w:line="360" w:lineRule="auto"/>
+        <w:ind w:firstLine="0"/>
+        <w:jc w:val="both"/>
+      </w:pPr>
+      <w:r>
+        <w:rPr>
+          <w:rFonts w:ascii="Arial" w:hAnsi="Arial" w:eastAsia="Arial" w:cs="Arial"/>
+          <w:b w:val="1"/>
+          <w:bCs w:val="1"/>
+          <w:color w:val="auto"/>
+          <w:sz w:val="24"/>
+          <w:szCs w:val="24"/>
+        </w:rPr>
+        <w:t>F</w:t>
+      </w:r>
+      <w:r>
+        <w:rPr>
+          <w:rFonts w:ascii="Arial" w:hAnsi="Arial" w:eastAsia="Arial" w:cs="Arial"/>
+          <w:b w:val="1"/>
+          <w:bCs w:val="1"/>
+          <w:color w:val="auto"/>
+          <w:sz w:val="24"/>
+          <w:szCs w:val="24"/>
+        </w:rPr>
+        <w:t>UNCIONALIDADES</w:t>
+      </w:r>
+    </w:p>
+    <w:p>
+      <w:pPr>
+        <w:pStyle w:val="Normal"/>
+        <w:jc w:val="both"/>
+      </w:pPr>
+      <w:r>
+        <w:rPr>
+          <w:rFonts w:ascii="Arial" w:hAnsi="Arial" w:eastAsia="Arial" w:cs="Arial"/>
+          <w:noProof w:val="0"/>
+          <w:sz w:val="24"/>
+          <w:szCs w:val="24"/>
+          <w:lang w:val="pt-BR"/>
+        </w:rPr>
+        <w:t>O sistema conta com um sistema de login e cadastro de usuário, onde é possível e gerenciar suas entradas e saídas. Esses usuários podem ser vinculados a campanhas e mesas, permitindo que cada jogador tenha sua participação organizada dentro dos diferentes mundos criados na plataforma.</w:t>
+      </w:r>
+    </w:p>
+    <w:p>
+      <w:pPr>
+        <w:ind w:firstLine="708"/>
+        <w:jc w:val="both"/>
+      </w:pPr>
+      <w:r>
+        <w:rPr>
+          <w:rFonts w:ascii="Arial" w:hAnsi="Arial" w:eastAsia="Arial" w:cs="Arial"/>
+          <w:noProof w:val="0"/>
+          <w:sz w:val="24"/>
+          <w:szCs w:val="24"/>
+          <w:lang w:val="pt-BR"/>
+        </w:rPr>
+        <w:t>As campanhas funcionam como o centro das aventuras. Elas podem ser criadas com um código de acesso, o que permite que outros usuários entrem facilmente. Além disso, cada campanha se conecta diretamente às mesas e aos mundos, mantendo tudo organizado dentro da mesma estrutura.</w:t>
+      </w:r>
+    </w:p>
+    <w:p>
+      <w:pPr>
+        <w:ind w:firstLine="708"/>
+        <w:jc w:val="both"/>
+      </w:pPr>
+      <w:r>
+        <w:rPr>
+          <w:rFonts w:ascii="Arial" w:hAnsi="Arial" w:eastAsia="Arial" w:cs="Arial"/>
+          <w:noProof w:val="0"/>
+          <w:sz w:val="24"/>
+          <w:szCs w:val="24"/>
+          <w:lang w:val="pt-BR"/>
+        </w:rPr>
+        <w:t>As mesas e mundos são responsáveis por dar vida às sessões de RPG. As mesas representam onde as partidas acontecem, enquanto os mundos são os cenários personalizados criados para cada história. Tudo é interligado, permitindo que usuários, campanhas e mesas trabalhem juntos dentro do mesmo ambiente.</w:t>
+      </w:r>
+    </w:p>
+    <w:p>
+      <w:pPr>
+        <w:ind w:firstLine="708"/>
+        <w:jc w:val="both"/>
+      </w:pPr>
+      <w:r>
+        <w:rPr>
+          <w:rFonts w:ascii="Arial" w:hAnsi="Arial" w:eastAsia="Arial" w:cs="Arial"/>
+          <w:noProof w:val="0"/>
+          <w:sz w:val="24"/>
+          <w:szCs w:val="24"/>
+          <w:lang w:val="pt-BR"/>
+        </w:rPr>
+        <w:t>O sistema também possui um módulo de elementos do RPG, onde ficam registrados itens, habilidades e outros componentes utilizados durante o jogo. Esses elementos podem ser associados às mesas e campanhas, tornando o sistema mais flexível e adaptável a diferentes tipos de narrativa.</w:t>
+      </w:r>
+    </w:p>
+    <w:p>
+      <w:pPr>
+        <w:jc w:val="both"/>
+      </w:pPr>
+      <w:r>
+        <w:rPr>
+          <w:rFonts w:ascii="Arial" w:hAnsi="Arial" w:eastAsia="Arial" w:cs="Arial"/>
+          <w:noProof w:val="0"/>
+          <w:sz w:val="24"/>
+          <w:szCs w:val="24"/>
+          <w:lang w:val="pt-BR"/>
+        </w:rPr>
+        <w:t>Por fim, o dashboard reúne as principais informações do sistema em um só lugar. Nele é possível visualizar dados como a quantidade de elementos por mesa e outras informações gerais que ajudam a acompanhar o funcionamento da plataforma.</w:t>
+      </w:r>
+    </w:p>
+    <w:p>
+      <w:pPr>
+        <w:pStyle w:val="Normal"/>
+        <w:spacing w:line="360" w:lineRule="auto"/>
+        <w:ind w:firstLine="0"/>
+        <w:jc w:val="both"/>
+        <w:rPr>
+          <w:rFonts w:ascii="Arial" w:hAnsi="Arial" w:eastAsia="Arial" w:cs="Arial"/>
+          <w:b w:val="0"/>
+          <w:bCs w:val="0"/>
+          <w:color w:val="auto"/>
+          <w:sz w:val="24"/>
+          <w:szCs w:val="24"/>
+          <w:u w:val="single"/>
+        </w:rPr>
+      </w:pPr>
     </w:p>
     <w:p>
       <w:pPr>
@@ -2735,8 +2853,8 @@
       <w:r>
         <w:rPr>
           <w:rFonts w:ascii="Arial" w:hAnsi="Arial" w:eastAsia="Arial" w:cs="Arial"/>
-          <w:b w:val="0"/>
-          <w:bCs w:val="0"/>
+          <w:b w:val="1"/>
+          <w:bCs w:val="1"/>
           <w:color w:val="auto"/>
           <w:sz w:val="24"/>
           <w:szCs w:val="24"/>
@@ -2749,101 +2867,220 @@
         <w:pStyle w:val="Normal"/>
         <w:spacing w:line="360" w:lineRule="auto"/>
         <w:jc w:val="both"/>
-      </w:pPr>
-      <w:r>
-        <w:rPr>
-          <w:rFonts w:ascii="Arial" w:hAnsi="Arial" w:eastAsia="Arial" w:cs="Arial"/>
-          <w:b w:val="0"/>
-          <w:bCs w:val="0"/>
-          <w:color w:val="auto"/>
-          <w:sz w:val="24"/>
-          <w:szCs w:val="24"/>
-        </w:rPr>
-        <w:t xml:space="preserve">Por fim, o projeto visa criar um site </w:t>
-      </w:r>
-      <w:r>
-        <w:rPr>
-          <w:rFonts w:ascii="Arial" w:hAnsi="Arial" w:eastAsia="Arial" w:cs="Arial"/>
-          <w:b w:val="0"/>
-          <w:bCs w:val="0"/>
-          <w:color w:val="auto"/>
-          <w:sz w:val="24"/>
-          <w:szCs w:val="24"/>
-        </w:rPr>
-        <w:t xml:space="preserve">institucional, que contenha informações sobre </w:t>
-      </w:r>
-      <w:r>
-        <w:rPr>
-          <w:rFonts w:ascii="Arial" w:hAnsi="Arial" w:eastAsia="Arial" w:cs="Arial"/>
-          <w:b w:val="0"/>
-          <w:bCs w:val="0"/>
-          <w:color w:val="auto"/>
-          <w:sz w:val="24"/>
-          <w:szCs w:val="24"/>
-        </w:rPr>
-        <w:t>RPG’s</w:t>
-      </w:r>
-      <w:r>
-        <w:rPr>
-          <w:rFonts w:ascii="Arial" w:hAnsi="Arial" w:eastAsia="Arial" w:cs="Arial"/>
-          <w:b w:val="0"/>
-          <w:bCs w:val="0"/>
-          <w:color w:val="auto"/>
-          <w:sz w:val="24"/>
-          <w:szCs w:val="24"/>
-        </w:rPr>
-        <w:t>, visando facilitar a criação um sistema único e autoral</w:t>
-      </w:r>
-      <w:r>
-        <w:rPr>
-          <w:rFonts w:ascii="Arial" w:hAnsi="Arial" w:eastAsia="Arial" w:cs="Arial"/>
-          <w:b w:val="0"/>
-          <w:bCs w:val="0"/>
-          <w:color w:val="auto"/>
-          <w:sz w:val="24"/>
-          <w:szCs w:val="24"/>
-        </w:rPr>
-        <w:t xml:space="preserve"> e disponibilizar esses sistemas para outros usuários, tanto para criação de fichas, montagem de mesas</w:t>
-      </w:r>
-      <w:r>
-        <w:rPr>
-          <w:rFonts w:ascii="Arial" w:hAnsi="Arial" w:eastAsia="Arial" w:cs="Arial"/>
-          <w:b w:val="0"/>
-          <w:bCs w:val="0"/>
-          <w:color w:val="auto"/>
-          <w:sz w:val="24"/>
-          <w:szCs w:val="24"/>
-        </w:rPr>
-        <w:t xml:space="preserve"> e inserção de itens</w:t>
-      </w:r>
-      <w:r>
-        <w:rPr>
-          <w:rFonts w:ascii="Arial" w:hAnsi="Arial" w:eastAsia="Arial" w:cs="Arial"/>
-          <w:b w:val="0"/>
-          <w:bCs w:val="0"/>
-          <w:color w:val="auto"/>
-          <w:sz w:val="24"/>
-          <w:szCs w:val="24"/>
-        </w:rPr>
-        <w:t xml:space="preserve"> e habilidades</w:t>
-      </w:r>
-      <w:r>
-        <w:rPr>
-          <w:rFonts w:ascii="Arial" w:hAnsi="Arial" w:eastAsia="Arial" w:cs="Arial"/>
-          <w:b w:val="0"/>
-          <w:bCs w:val="0"/>
-          <w:color w:val="auto"/>
-          <w:sz w:val="24"/>
-          <w:szCs w:val="24"/>
-        </w:rPr>
-        <w:t>.</w:t>
-      </w:r>
+        <w:rPr>
+          <w:rFonts w:ascii="Arial" w:hAnsi="Arial" w:eastAsia="Arial" w:cs="Arial"/>
+          <w:b w:val="0"/>
+          <w:bCs w:val="0"/>
+          <w:color w:val="auto"/>
+          <w:sz w:val="24"/>
+          <w:szCs w:val="24"/>
+        </w:rPr>
+      </w:pPr>
     </w:p>
     <w:p>
       <w:pPr>
         <w:pStyle w:val="Normal"/>
         <w:spacing w:line="360" w:lineRule="auto"/>
         <w:jc w:val="both"/>
+        <w:rPr>
+          <w:rFonts w:ascii="Arial" w:hAnsi="Arial" w:eastAsia="Arial" w:cs="Arial"/>
+          <w:b w:val="0"/>
+          <w:bCs w:val="0"/>
+          <w:color w:val="auto"/>
+          <w:sz w:val="24"/>
+          <w:szCs w:val="24"/>
+        </w:rPr>
+      </w:pPr>
+      <w:r>
+        <w:rPr>
+          <w:rFonts w:ascii="Arial" w:hAnsi="Arial" w:eastAsia="Arial" w:cs="Arial"/>
+          <w:b w:val="0"/>
+          <w:bCs w:val="0"/>
+          <w:color w:val="auto"/>
+          <w:sz w:val="24"/>
+          <w:szCs w:val="24"/>
+        </w:rPr>
+        <w:t>Melhorias futuras</w:t>
+      </w:r>
+    </w:p>
+    <w:p>
+      <w:pPr>
+        <w:ind w:firstLine="708"/>
+        <w:jc w:val="both"/>
+      </w:pPr>
+      <w:r>
+        <w:rPr>
+          <w:rFonts w:ascii="Arial" w:hAnsi="Arial" w:eastAsia="Arial" w:cs="Arial"/>
+          <w:noProof w:val="0"/>
+          <w:sz w:val="24"/>
+          <w:szCs w:val="24"/>
+          <w:lang w:val="pt-BR"/>
+        </w:rPr>
+        <w:t>Está previsto a criação de personagens dentro da plataforma. Permitindo que os jogadores desenvolvam e personalizem seus próprios personagens, tornando a experiência de jogo mais imersiva e organizada dentro do sistema.</w:t>
+      </w:r>
+    </w:p>
+    <w:p>
+      <w:pPr>
+        <w:ind w:firstLine="708"/>
+        <w:jc w:val="both"/>
+      </w:pPr>
+      <w:r>
+        <w:rPr>
+          <w:rFonts w:ascii="Arial" w:hAnsi="Arial" w:eastAsia="Arial" w:cs="Arial"/>
+          <w:noProof w:val="0"/>
+          <w:sz w:val="24"/>
+          <w:szCs w:val="24"/>
+          <w:lang w:val="pt-BR"/>
+        </w:rPr>
+        <w:t>Também está prevista a ampliação da dashboard, com a adição de mais informações relevantes e acessíveis ao público.</w:t>
+      </w:r>
+    </w:p>
+    <w:p>
+      <w:pPr>
+        <w:ind w:firstLine="708"/>
+        <w:jc w:val="both"/>
+      </w:pPr>
+      <w:r>
+        <w:rPr>
+          <w:rFonts w:ascii="Arial" w:hAnsi="Arial" w:eastAsia="Arial" w:cs="Arial"/>
+          <w:noProof w:val="0"/>
+          <w:sz w:val="24"/>
+          <w:szCs w:val="24"/>
+          <w:lang w:val="pt-BR"/>
+        </w:rPr>
+        <w:t>Além disso, há a intenção de manter uma administração da plataforma, garantindo que o sistema esteja sempre atualizado, estável e preparado para receber atualizações e ajustes conforme a necessidade dos usuários.</w:t>
+      </w:r>
+    </w:p>
+    <w:p>
+      <w:pPr>
+        <w:pStyle w:val="Normal"/>
+        <w:ind w:firstLine="708"/>
+        <w:jc w:val="both"/>
+      </w:pPr>
+      <w:r>
+        <w:rPr>
+          <w:rFonts w:ascii="Arial" w:hAnsi="Arial" w:eastAsia="Arial" w:cs="Arial"/>
+          <w:noProof w:val="0"/>
+          <w:sz w:val="24"/>
+          <w:szCs w:val="24"/>
+          <w:lang w:val="pt-BR"/>
+        </w:rPr>
+        <w:t>Por fim, o projeto também visa sua disponibilidade para web, ampliando o acesso e permitindo que mais pessoas utilizem o sistema de forma prática e direta por meio de navegadores, sem limitações de plataforma.</w:t>
+      </w:r>
+    </w:p>
+    <w:p>
+      <w:pPr>
+        <w:pStyle w:val="Normal"/>
+        <w:spacing w:line="360" w:lineRule="auto"/>
+        <w:ind w:firstLine="708"/>
+        <w:jc w:val="both"/>
+      </w:pPr>
+      <w:r>
+        <w:rPr>
+          <w:rFonts w:ascii="Arial" w:hAnsi="Arial" w:eastAsia="Arial" w:cs="Arial"/>
+          <w:b w:val="0"/>
+          <w:bCs w:val="0"/>
+          <w:color w:val="auto"/>
+          <w:sz w:val="24"/>
+          <w:szCs w:val="24"/>
+        </w:rPr>
+        <w:t xml:space="preserve">Por fim, o projeto </w:t>
+      </w:r>
+      <w:r>
+        <w:rPr>
+          <w:rFonts w:ascii="Arial" w:hAnsi="Arial" w:eastAsia="Arial" w:cs="Arial"/>
+          <w:b w:val="0"/>
+          <w:bCs w:val="0"/>
+          <w:color w:val="auto"/>
+          <w:sz w:val="24"/>
+          <w:szCs w:val="24"/>
+        </w:rPr>
+        <w:t>tem por objetivo o acesso a uma plataforma</w:t>
+      </w:r>
+      <w:r>
+        <w:rPr>
+          <w:rFonts w:ascii="Arial" w:hAnsi="Arial" w:eastAsia="Arial" w:cs="Arial"/>
+          <w:b w:val="0"/>
+          <w:bCs w:val="0"/>
+          <w:color w:val="auto"/>
+          <w:sz w:val="24"/>
+          <w:szCs w:val="24"/>
+        </w:rPr>
+        <w:t xml:space="preserve">, que contenha informações sobre </w:t>
+      </w:r>
+      <w:r>
+        <w:rPr>
+          <w:rFonts w:ascii="Arial" w:hAnsi="Arial" w:eastAsia="Arial" w:cs="Arial"/>
+          <w:b w:val="0"/>
+          <w:bCs w:val="0"/>
+          <w:color w:val="auto"/>
+          <w:sz w:val="24"/>
+          <w:szCs w:val="24"/>
+        </w:rPr>
+        <w:t>RPG’s</w:t>
+      </w:r>
+      <w:r>
+        <w:rPr>
+          <w:rFonts w:ascii="Arial" w:hAnsi="Arial" w:eastAsia="Arial" w:cs="Arial"/>
+          <w:b w:val="0"/>
+          <w:bCs w:val="0"/>
+          <w:color w:val="auto"/>
+          <w:sz w:val="24"/>
+          <w:szCs w:val="24"/>
+        </w:rPr>
+        <w:t>, visando facilitar a criação um sistema único e autoral</w:t>
+      </w:r>
+      <w:r>
+        <w:rPr>
+          <w:rFonts w:ascii="Arial" w:hAnsi="Arial" w:eastAsia="Arial" w:cs="Arial"/>
+          <w:b w:val="0"/>
+          <w:bCs w:val="0"/>
+          <w:color w:val="auto"/>
+          <w:sz w:val="24"/>
+          <w:szCs w:val="24"/>
+        </w:rPr>
+        <w:t xml:space="preserve"> e disponibilizar esses sistemas para outros usuários, tanto para criação de fichas, montagem de mesas</w:t>
+      </w:r>
+      <w:r>
+        <w:rPr>
+          <w:rFonts w:ascii="Arial" w:hAnsi="Arial" w:eastAsia="Arial" w:cs="Arial"/>
+          <w:b w:val="0"/>
+          <w:bCs w:val="0"/>
+          <w:color w:val="auto"/>
+          <w:sz w:val="24"/>
+          <w:szCs w:val="24"/>
+        </w:rPr>
+        <w:t xml:space="preserve"> e inserção de itens</w:t>
+      </w:r>
+      <w:r>
+        <w:rPr>
+          <w:rFonts w:ascii="Arial" w:hAnsi="Arial" w:eastAsia="Arial" w:cs="Arial"/>
+          <w:b w:val="0"/>
+          <w:bCs w:val="0"/>
+          <w:color w:val="auto"/>
+          <w:sz w:val="24"/>
+          <w:szCs w:val="24"/>
+        </w:rPr>
+        <w:t xml:space="preserve"> e habilidades</w:t>
+      </w:r>
+      <w:r>
+        <w:rPr>
+          <w:rFonts w:ascii="Arial" w:hAnsi="Arial" w:eastAsia="Arial" w:cs="Arial"/>
+          <w:b w:val="0"/>
+          <w:bCs w:val="0"/>
+          <w:color w:val="auto"/>
+          <w:sz w:val="24"/>
+          <w:szCs w:val="24"/>
+        </w:rPr>
+        <w:t>.</w:t>
+      </w:r>
+    </w:p>
+    <w:p>
+      <w:pPr>
+        <w:pStyle w:val="Normal"/>
+        <w:spacing w:line="360" w:lineRule="auto"/>
+        <w:ind w:firstLine="708"/>
+        <w:jc w:val="both"/>
       </w:pPr>
       <w:r>
         <w:rPr>
@@ -2910,87 +3147,6 @@
           <w:szCs w:val="24"/>
         </w:rPr>
         <w:t xml:space="preserve"> será necessário um consenso entre Mestre e Jogador para que seja validado as informações de cada personagem individualmente.</w:t>
-      </w:r>
-    </w:p>
-    <w:p>
-      <w:pPr>
-        <w:pStyle w:val="Normal"/>
-        <w:spacing w:line="360" w:lineRule="auto"/>
-        <w:jc w:val="both"/>
-        <w:rPr>
-          <w:rFonts w:ascii="Arial" w:hAnsi="Arial" w:eastAsia="Arial" w:cs="Arial"/>
-          <w:b w:val="0"/>
-          <w:bCs w:val="0"/>
-          <w:color w:val="auto"/>
-          <w:sz w:val="24"/>
-          <w:szCs w:val="24"/>
-        </w:rPr>
-      </w:pPr>
-      <w:r>
-        <w:rPr>
-          <w:rFonts w:ascii="Arial" w:hAnsi="Arial" w:eastAsia="Arial" w:cs="Arial"/>
-          <w:b w:val="0"/>
-          <w:bCs w:val="0"/>
-          <w:color w:val="auto"/>
-          <w:sz w:val="24"/>
-          <w:szCs w:val="24"/>
-        </w:rPr>
-        <w:t xml:space="preserve">Ademais, esse projeto tem </w:t>
-      </w:r>
-      <w:r>
-        <w:rPr>
-          <w:rFonts w:ascii="Arial" w:hAnsi="Arial" w:eastAsia="Arial" w:cs="Arial"/>
-          <w:b w:val="0"/>
-          <w:bCs w:val="0"/>
-          <w:color w:val="auto"/>
-          <w:sz w:val="24"/>
-          <w:szCs w:val="24"/>
-        </w:rPr>
-        <w:t xml:space="preserve">como entrega sua versão final até </w:t>
-      </w:r>
-      <w:r>
-        <w:rPr>
-          <w:rFonts w:ascii="Arial" w:hAnsi="Arial" w:eastAsia="Arial" w:cs="Arial"/>
-          <w:b w:val="0"/>
-          <w:bCs w:val="0"/>
-          <w:color w:val="auto"/>
-          <w:sz w:val="24"/>
-          <w:szCs w:val="24"/>
-        </w:rPr>
-        <w:t>dia 28/05</w:t>
-      </w:r>
-      <w:r>
-        <w:rPr>
-          <w:rFonts w:ascii="Arial" w:hAnsi="Arial" w:eastAsia="Arial" w:cs="Arial"/>
-          <w:b w:val="0"/>
-          <w:bCs w:val="0"/>
-          <w:color w:val="auto"/>
-          <w:sz w:val="24"/>
-          <w:szCs w:val="24"/>
-        </w:rPr>
-        <w:t>/2026, a fim de validar e apresenta</w:t>
-      </w:r>
-      <w:r>
-        <w:rPr>
-          <w:rFonts w:ascii="Arial" w:hAnsi="Arial" w:eastAsia="Arial" w:cs="Arial"/>
-          <w:b w:val="0"/>
-          <w:bCs w:val="0"/>
-          <w:color w:val="auto"/>
-          <w:sz w:val="24"/>
-          <w:szCs w:val="24"/>
-        </w:rPr>
-        <w:t>r</w:t>
-      </w:r>
-      <w:r>
-        <w:rPr>
-          <w:rFonts w:ascii="Arial" w:hAnsi="Arial" w:eastAsia="Arial" w:cs="Arial"/>
-          <w:b w:val="0"/>
-          <w:bCs w:val="0"/>
-          <w:color w:val="auto"/>
-          <w:sz w:val="24"/>
-          <w:szCs w:val="24"/>
-        </w:rPr>
-        <w:t xml:space="preserve"> o site.</w:t>
       </w:r>
     </w:p>
     <w:sectPr>

</xml_diff>